<commit_message>
audit théologique regard_versets : 4 corrections
VISAGE v1: murmure pudeur ("Parfaitement créé. Reconnais.")
TISSU v7: "esclaves" → "ceux sous votre autorité"
VEHICULE v8: méditation reformulée
INDETERMINE v8: As-Samad "l'Absolu" remplace glose Hamidullah

Co-Authored-By: Claude Opus 4.6 (1M context) <noreply@anthropic.com>
</commit_message>
<xml_diff>
--- a/ECRITS_NIYYAH/regard_versets.docx
+++ b/ECRITS_NIYYAH/regard_versets.docx
@@ -3176,7 +3176,7 @@
           <w:sz w:val="22"/>
           <w:szCs w:val="22"/>
         </w:rPr>
-        <w:t xml:space="preserve">La forme la plus belle. Pour toi.</w:t>
+        <w:t xml:space="preserve">Parfaitement créé. Reconnais.</w:t>
       </w:r>
     </w:p>
     <w:p>
@@ -4138,7 +4138,7 @@
           <w:sz w:val="22"/>
           <w:szCs w:val="22"/>
         </w:rPr>
-        <w:t xml:space="preserve">Dis : « Il est Allah, Unique. Allah, Le Seul à être imploré pour ce que nous désirons. Il n'a jamais engendré, n'a pas été engendré non plus. Et nul n'est égal à Lui. »</w:t>
+        <w:t xml:space="preserve">Dis : « Il est Allah, Unique. Allah, l'Absolu (As-Samad). Il n'a jamais engendré, n'a pas été engendré non plus. Et nul n'est égal à Lui. »</w:t>
       </w:r>
     </w:p>
     <w:p>
@@ -7713,7 +7713,7 @@
           <w:sz w:val="22"/>
           <w:szCs w:val="22"/>
         </w:rPr>
-        <w:t xml:space="preserve">Ô vous qui avez cru ! Que les esclaves que vous possédez vous demandent permission avant d'entrer, ainsi que ceux des vôtres qui n'ont pas encore atteint la puberté, à trois moments : avant la prière de l'aube (Salât Al Fajr), à midi quand vous enlevez vos vêtements, ainsi qu'après la prière de la nuit (Salât Al ʿIchâʼ) ; trois occasions de vous dévêtir.</w:t>
+        <w:t xml:space="preserve">Ô vous qui avez cru ! Que ceux qui sont sous votre autorité vous demandent permission avant d'entrer, ainsi que ceux des vôtres qui n'ont pas encore atteint la puberté, à trois moments : avant la prière de l'aube (Salât Al Fajr), à midi quand vous enlevez vos vêtements, ainsi qu'après la prière de la nuit (Salât Al ʿIchâʼ) ; trois occasions de vous dévêtir.</w:t>
       </w:r>
     </w:p>
     <w:p>
@@ -8311,7 +8311,7 @@
           <w:sz w:val="22"/>
           <w:szCs w:val="22"/>
         </w:rPr>
-        <w:t xml:space="preserve">Sincère sur la mer. Oublieux à terre.</w:t>
+        <w:t xml:space="preserve">En danger, on se souvient. Sauvé, on oublie.</w:t>
       </w:r>
     </w:p>
     <w:p>

</xml_diff>